<commit_message>
Curso: Pacote de Modelos — Modelo 14 alinhado à regra 1+1 (Res. ANPD nº 2/2022)
Substitui os estáticos diagramados do Pacote (PDF + Word) pela versão final
com o Modelo 14 reescrito: sai o score 0-18 por 6 critérios, entra a regra
"1+1" da Resolução CD/ANPD nº 2/2022 (≥1 critério GERAL E ≥1 ESPECÍFICO =
ALTO RISCO + RIPD), espelhando a Matriz de Priorização já em prod na Fase 2.

Também atualiza a fonte lib/pacote-modelos.ts (versão plana gerada ao vivo
pelo painel do facilitador e por ?instituicao=X) pra manter consistência.

Co-Authored-By: Claude Opus 4.8 <noreply@anthropic.com>
</commit_message>
<xml_diff>
--- a/apps/lgpd-curso/public/pacote-modelos-pgp.docx
+++ b/apps/lgpd-curso/public/pacote-modelos-pgp.docx
@@ -10665,7 +10665,7 @@
       </w:pPr>
       <w:r>
         <w:rPr/>
-        <w:t xml:space="preserve">Na Fase 2 do PGP, pra priorizar quais processos entram primeiro no Inventário detalhado da Fase 3. Aplicar a cada processo identificado. Score 0-18 (1-3 pontos por critério × 6 critérios).</w:t>
+        <w:t xml:space="preserve">Na Fase 2 do PGP, pra identificar quais processos são de ALTO RISCO — esses entram primeiro no Inventário (Fase 3) e exigem RIPD (Art. 38). Aplique a regra '1+1' da Resolução a cada processo: é alto risco quando atende a pelo menos UM critério GERAL E a pelo menos UM ESPECÍFICO.</w:t>
       </w:r>
     </w:p>
     <w:p>
@@ -10696,6 +10696,17 @@
           <w:sz w:val="20"/>
         </w:rPr>
         <w:t xml:space="preserve">[NOME DO PROCESSO]</w:t>
+      </w:r>
+    </w:p>
+    <w:p>
+      <w:pPr>
+        <w:pStyle w:val="Heading3"/>
+        <w:spacing w:before="240" w:after="120" w:line="276" w:lineRule="auto"/>
+        <w:keepNext/>
+      </w:pPr>
+      <w:r>
+        <w:rPr/>
+        <w:t xml:space="preserve">1) Critério GERAL — larga escala (atende se marcar ao menos um)</w:t>
       </w:r>
     </w:p>
     <w:tbl>
@@ -10736,7 +10747,7 @@
                 <w:b/>
                 <w:color w:val="14304F"/>
               </w:rPr>
-              <w:t xml:space="preserve">👥 Volume de titulares</w:t>
+              <w:t xml:space="preserve">a) Número significativo de titulares</w:t>
             </w:r>
           </w:p>
         </w:tc>
@@ -10762,7 +10773,7 @@
                 <w:color w:val="B83A26"/>
                 <w:sz w:val="20"/>
               </w:rPr>
-              <w:t xml:space="preserve">[Baixo 1 = até 100 / Médio 2 = 100-1.000 / Alto 3 = +1.000]</w:t>
+              <w:t xml:space="preserve">[ (  ) Aplica   (  ) Não aplica ]</w:t>
             </w:r>
           </w:p>
         </w:tc>
@@ -10788,7 +10799,7 @@
                 <w:b/>
                 <w:color w:val="14304F"/>
               </w:rPr>
-              <w:t xml:space="preserve">🔒 Sensibilidade dos dados</w:t>
+              <w:t xml:space="preserve">b) Volume de dados envolvidos</w:t>
             </w:r>
           </w:p>
         </w:tc>
@@ -10814,7 +10825,7 @@
                 <w:color w:val="B83A26"/>
                 <w:sz w:val="20"/>
               </w:rPr>
-              <w:t xml:space="preserve">[Baixo 1 = cadastrais / Médio 2 = financeiros, comportamentais / Alto 3 = sensíveis Art. 5º II]</w:t>
+              <w:t xml:space="preserve">[ (  ) Aplica   (  ) Não aplica ]</w:t>
             </w:r>
           </w:p>
         </w:tc>
@@ -10840,7 +10851,7 @@
                 <w:b/>
                 <w:color w:val="14304F"/>
               </w:rPr>
-              <w:t xml:space="preserve">👶 Vulnerabilidade dos titulares</w:t>
+              <w:t xml:space="preserve">c) Duração, frequência e extensão geográfica</w:t>
             </w:r>
           </w:p>
         </w:tc>
@@ -10866,11 +10877,45 @@
                 <w:color w:val="B83A26"/>
                 <w:sz w:val="20"/>
               </w:rPr>
-              <w:t xml:space="preserve">[Baixo 1 = apenas adultos / Médio 2 = eventualmente vulneráveis / Alto 3 = sistematicamente menores/idosos]</w:t>
+              <w:t xml:space="preserve">[ (  ) Aplica   (  ) Não aplica ]</w:t>
             </w:r>
           </w:p>
         </w:tc>
       </w:tr>
+    </w:tbl>
+    <w:p>
+      <w:pPr>
+        <w:spacing w:after="120" w:line="276" w:lineRule="auto"/>
+      </w:pPr>
+    </w:p>
+    <w:p>
+      <w:pPr>
+        <w:pStyle w:val="Heading3"/>
+        <w:spacing w:before="240" w:after="120" w:line="276" w:lineRule="auto"/>
+        <w:keepNext/>
+      </w:pPr>
+      <w:r>
+        <w:rPr/>
+        <w:t xml:space="preserve">2) Critério ESPECÍFICO (atende se marcar ao menos um)</w:t>
+      </w:r>
+    </w:p>
+    <w:tbl>
+      <w:tblPr>
+        <w:tblW w:w="9000" w:type="dxa"/>
+        <w:tblBorders>
+          <w:top w:val="single" w:sz="4" w:color="E5DFD2"/>
+          <w:left w:val="single" w:sz="4" w:color="E5DFD2"/>
+          <w:bottom w:val="single" w:sz="4" w:color="E5DFD2"/>
+          <w:right w:val="single" w:sz="4" w:color="E5DFD2"/>
+          <w:insideH w:val="single" w:sz="4" w:color="E5DFD2"/>
+          <w:insideV w:val="single" w:sz="4" w:color="E5DFD2"/>
+        </w:tblBorders>
+        <w:tblLayout w:type="fixed"/>
+      </w:tblPr>
+      <w:tblGrid>
+        <w:gridCol w:w="3500"/>
+        <w:gridCol w:w="5500"/>
+      </w:tblGrid>
       <w:tr>
         <w:tc>
           <w:tcPr>
@@ -10892,7 +10937,7 @@
                 <w:b/>
                 <w:color w:val="14304F"/>
               </w:rPr>
-              <w:t xml:space="preserve">📣 Exposição pública</w:t>
+              <w:t xml:space="preserve">a) Tecnologias emergentes ou inovadoras</w:t>
             </w:r>
           </w:p>
         </w:tc>
@@ -10918,7 +10963,7 @@
                 <w:color w:val="B83A26"/>
                 <w:sz w:val="20"/>
               </w:rPr>
-              <w:t xml:space="preserve">[Baixo 1 = restrito / Médio 2 = compartilhamento limitado / Alto 3 = publicação ampla]</w:t>
+              <w:t xml:space="preserve">[ (  ) Aplica   (  ) Não aplica ]</w:t>
             </w:r>
           </w:p>
         </w:tc>
@@ -10944,7 +10989,7 @@
                 <w:b/>
                 <w:color w:val="14304F"/>
               </w:rPr>
-              <w:t xml:space="preserve">🤖 Tecnologias inovadoras</w:t>
+              <w:t xml:space="preserve">b) Vigilância de zonas acessíveis ao público</w:t>
             </w:r>
           </w:p>
         </w:tc>
@@ -10970,7 +11015,7 @@
                 <w:color w:val="B83A26"/>
                 <w:sz w:val="20"/>
               </w:rPr>
-              <w:t xml:space="preserve">[Baixo 1 = planilhas / Médio 2 = sistemas convencionais / Alto 3 = IA, biometria, decisões automatizadas]</w:t>
+              <w:t xml:space="preserve">[ (  ) Aplica   (  ) Não aplica ]</w:t>
             </w:r>
           </w:p>
         </w:tc>
@@ -10996,7 +11041,7 @@
                 <w:b/>
                 <w:color w:val="14304F"/>
               </w:rPr>
-              <w:t xml:space="preserve">🤝 Compartilhamentos com terceiros</w:t>
+              <w:t xml:space="preserve">c) Decisões unicamente automatizadas / profiling</w:t>
             </w:r>
           </w:p>
         </w:tc>
@@ -11022,7 +11067,59 @@
                 <w:color w:val="B83A26"/>
                 <w:sz w:val="20"/>
               </w:rPr>
-              <w:t xml:space="preserve">[Baixo 1 = nenhum/interno / Médio 2 = 1-2 operadores / Alto 3 = múltiplos ou transferência internacional]</w:t>
+              <w:t xml:space="preserve">[ (  ) Aplica   (  ) Não aplica ]</w:t>
+            </w:r>
+          </w:p>
+        </w:tc>
+      </w:tr>
+      <w:tr>
+        <w:tc>
+          <w:tcPr>
+            <w:tcW w:w="3500" w:type="dxa"/>
+            <w:shd w:val="clear" w:color="auto" w:fill="F5F0E2"/>
+            <w:tcMar>
+              <w:top w:w="80" w:type="dxa"/>
+              <w:left w:w="120" w:type="dxa"/>
+              <w:bottom w:w="80" w:type="dxa"/>
+              <w:right w:w="120" w:type="dxa"/>
+            </w:tcMar>
+          </w:tcPr>
+          <w:p>
+            <w:pPr>
+              <w:spacing w:before="0" w:after="0" w:line="276" w:lineRule="auto"/>
+            </w:pPr>
+            <w:r>
+              <w:rPr>
+                <w:b/>
+                <w:color w:val="14304F"/>
+              </w:rPr>
+              <w:t xml:space="preserve">d) Dados sensíveis ou de crianças, adolescentes e idosos</w:t>
+            </w:r>
+          </w:p>
+        </w:tc>
+        <w:tc>
+          <w:tcPr>
+            <w:tcW w:w="5500" w:type="dxa"/>
+            <w:tcMar>
+              <w:top w:w="80" w:type="dxa"/>
+              <w:left w:w="120" w:type="dxa"/>
+              <w:bottom w:w="80" w:type="dxa"/>
+              <w:right w:w="120" w:type="dxa"/>
+            </w:tcMar>
+          </w:tcPr>
+          <w:p>
+            <w:pPr>
+              <w:spacing w:before="0" w:after="0" w:line="276" w:lineRule="auto"/>
+            </w:pPr>
+            <w:r>
+              <w:rPr>
+                <w:rFonts w:ascii="Consolas" w:hAnsi="Consolas"/>
+                <w:b/>
+                <w:i/>
+                <w:color w:val="B83A26"/>
+                <w:sz w:val="20"/>
+              </w:rPr>
+              <w:t xml:space="preserve">[ (  ) Aplica   (  ) Não aplica ]</w:t>
             </w:r>
           </w:p>
         </w:tc>
@@ -11039,7 +11136,7 @@
       </w:pPr>
       <w:r>
         <w:rPr/>
-        <w:t xml:space="preserve">Score total do processo: </w:t>
+        <w:t xml:space="preserve">Veredito (regra 1+1): </w:t>
       </w:r>
       <w:r>
         <w:rPr>
@@ -11049,16 +11146,7 @@
           <w:color w:val="B83A26"/>
           <w:sz w:val="20"/>
         </w:rPr>
-        <w:t xml:space="preserve">[SOMA 0-18]</w:t>
-      </w:r>
-    </w:p>
-    <w:p>
-      <w:pPr>
-        <w:spacing w:after="120" w:line="276" w:lineRule="auto"/>
-      </w:pPr>
-      <w:r>
-        <w:rPr/>
-        <w:t xml:space="preserve">Faixas: 0-6 BAIXA prioridade · 7-12 MÉDIA · 13-18 ALTA</w:t>
+        <w:t xml:space="preserve">[ALTO RISCO se marcou ≥1 Geral E ≥1 Específico — senão, risco padrão]</w:t>
       </w:r>
     </w:p>
     <w:p>
@@ -11077,7 +11165,7 @@
           <w:color w:val="B83A26"/>
           <w:sz w:val="20"/>
         </w:rPr>
-        <w:t xml:space="preserve">[Comentário curto explicando a pontuação — opcional mas recomendado]</w:t>
+        <w:t xml:space="preserve">[Comentário curto — opcional mas recomendado]</w:t>
       </w:r>
     </w:p>
     <w:p>
@@ -11097,7 +11185,7 @@
       </w:pPr>
       <w:r>
         <w:rPr/>
-        <w:t xml:space="preserve">Após pontuar todos os processos, ordenar do maior score pro menor. Os 5-10 primeiros entram no Inventário detalhado da Fase 3.</w:t>
+        <w:t xml:space="preserve">Liste primeiro os processos de ALTO RISCO; entre eles, os com mais critérios marcados. Esses entram no Inventário detalhado da Fase 3 e exigem RIPD.</w:t>
       </w:r>
     </w:p>
     <w:p>
@@ -11150,7 +11238,7 @@
       </w:pPr>
       <w:r>
         <w:rPr/>
-        <w:t xml:space="preserve">Volume 3 (Alto · ~24mil/ano) · Sensibilidade 3 (Alto · dados de saúde) · Vulneráveis 2 (Médio · idosos eventualmente) · Exposição 1 (Baixo · restrito) · Tecnologias 2 (Médio · sistema convencional) · Compartilhamentos 2 (Médio · ESUS-DAB federal)</w:t>
+        <w:t xml:space="preserve">GERAL: número de titulares (Aplica) · volume de dados (Aplica) · duração/extensão (Não aplica).</w:t>
       </w:r>
     </w:p>
     <w:p>
@@ -11166,7 +11254,7 @@
       </w:pPr>
       <w:r>
         <w:rPr/>
-        <w:t xml:space="preserve">Score: 13/18 = ALTA prioridade.</w:t>
+        <w:t xml:space="preserve">ESPECÍFICO: tecnologias (Não aplica) · vigilância (Não aplica) · decisões automatizadas (Não aplica) · dados sensíveis ou vulneráveis (Aplica — saúde + idosos).</w:t>
       </w:r>
     </w:p>
     <w:p>
@@ -11182,7 +11270,7 @@
       </w:pPr>
       <w:r>
         <w:rPr/>
-        <w:t xml:space="preserve">Justificativa: alto volume + dados de saúde sensíveis. Entra como prioridade nº 1 no Inventário.</w:t>
+        <w:t xml:space="preserve">Veredito: ALTO RISCO (tem ≥1 geral E ≥1 específico). Entra como prioridade nº 1 no Inventário e exige RIPD.</w:t>
       </w:r>
     </w:p>
     <w:p>
@@ -17334,12 +17422,5 @@
       <w:sz w:val="26"/>
     </w:rPr>
   </w:style>
-  <w:style w:type="character" w:styleId="Hyperlink">
-    <w:name w:val="Hyperlink"/>
-    <w:rPr>
-      <w:color w:val="2D6AC8"/>
-      <w:u w:val="single"/>
-    </w:rPr>
-  </w:style>
 </w:styles>
 </file>
</xml_diff>